<commit_message>
Updated the Secure Settings - Identify Options procedure (copy-and-paste error / ID field note)
</commit_message>
<xml_diff>
--- a/source/reference_documents/tertiary_documents/implementation/Secure Settings/identify options/Secure Settings - Identify Options.docx
+++ b/source/reference_documents/tertiary_documents/implementation/Secure Settings/identify options/Secure Settings - Identify Options.docx
@@ -40,7 +40,7 @@
         <w:t xml:space="preserve">Version </w:t>
       </w:r>
       <w:r>
-        <w:t>2</w:t>
+        <w:t>3</w:t>
       </w:r>
     </w:p>
     <w:p>
@@ -57,7 +57,7 @@
         <w:rPr>
           <w:noProof/>
         </w:rPr>
-        <w:t>9/4/25 11:02 AM</w:t>
+        <w:t>9/4/25 1:22 PM</w:t>
       </w:r>
       <w:r>
         <w:fldChar w:fldCharType="end"/>
@@ -1538,16 +1538,16 @@
         <w:t xml:space="preserve">The </w:t>
       </w:r>
       <w:r>
-        <w:t>element cybersecurity requirements</w:t>
-      </w:r>
-      <w:r>
-        <w:t xml:space="preserve"> </w:t>
-      </w:r>
-      <w:r>
-        <w:t>catalog</w:t>
-      </w:r>
-      <w:r>
-        <w:t xml:space="preserve"> may be documented using the</w:t>
+        <w:t>tool’s</w:t>
+      </w:r>
+      <w:r>
+        <w:t xml:space="preserve"> cybersecurity</w:t>
+      </w:r>
+      <w:r>
+        <w:t xml:space="preserve">-relevant options </w:t>
+      </w:r>
+      <w:r>
+        <w:t>may be documented using the</w:t>
       </w:r>
       <w:r>
         <w:t xml:space="preserve"> </w:t>
@@ -2394,6 +2394,9 @@
       </w:r>
     </w:p>
     <w:p>
+      <w:pPr>
+        <w:ind w:left="720" w:hanging="720"/>
+      </w:pPr>
       <w:r>
         <w:rPr>
           <w:b/>
@@ -2524,6 +2527,51 @@
       </w:r>
       <w:r>
         <w:t>option</w:t>
+      </w:r>
+      <w:r>
+        <w:t>.</w:t>
+      </w:r>
+    </w:p>
+    <w:p>
+      <w:pPr>
+        <w:ind w:left="720" w:hanging="720"/>
+      </w:pPr>
+      <w:r>
+        <w:rPr>
+          <w:b/>
+          <w:bCs/>
+          <w:color w:val="0070C0"/>
+        </w:rPr>
+        <w:t>Note:</w:t>
+      </w:r>
+      <w:r>
+        <w:tab/>
+      </w:r>
+      <w:r>
+        <w:t xml:space="preserve">An ID of the form </w:t>
+      </w:r>
+      <w:r>
+        <w:rPr>
+          <w:rFonts w:ascii="Courier New" w:hAnsi="Courier New" w:cs="Courier New"/>
+          <w:b/>
+          <w:bCs/>
+          <w:color w:val="0070C0"/>
+          <w:sz w:val="20"/>
+          <w:szCs w:val="20"/>
+        </w:rPr>
+        <w:t>&lt;TOOL&gt;-&lt;zero-leading number&gt;</w:t>
+      </w:r>
+      <w:r>
+        <w:t xml:space="preserve"> is recommended</w:t>
+      </w:r>
+      <w:r>
+        <w:t>.</w:t>
+      </w:r>
+      <w:r>
+        <w:t xml:space="preserve"> Where multiple tools of the same type (such as compilers) use the same options, a generalized tool type should be used</w:t>
+      </w:r>
+      <w:r>
+        <w:t xml:space="preserve"> for the ID’s prefix</w:t>
       </w:r>
       <w:r>
         <w:t>.</w:t>

</xml_diff>

<commit_message>
added the Secure Settings - Categorize Options procedure material
</commit_message>
<xml_diff>
--- a/source/reference_documents/tertiary_documents/implementation/Secure Settings/identify options/Secure Settings - Identify Options.docx
+++ b/source/reference_documents/tertiary_documents/implementation/Secure Settings/identify options/Secure Settings - Identify Options.docx
@@ -40,7 +40,7 @@
         <w:t xml:space="preserve">Version </w:t>
       </w:r>
       <w:r>
-        <w:t>3</w:t>
+        <w:t>4</w:t>
       </w:r>
     </w:p>
     <w:p>
@@ -57,7 +57,7 @@
         <w:rPr>
           <w:noProof/>
         </w:rPr>
-        <w:t>9/4/25 1:22 PM</w:t>
+        <w:t>9/5/25 11:14 AM</w:t>
       </w:r>
       <w:r>
         <w:fldChar w:fldCharType="end"/>
@@ -828,7 +828,19 @@
         <w:pStyle w:val="BodyText"/>
       </w:pPr>
       <w:r>
-        <w:t xml:space="preserve">It is required that the development group provide all relevant documentation related to the </w:t>
+        <w:t xml:space="preserve">It is required that the </w:t>
+      </w:r>
+      <w:r>
+        <w:t>cybersecurity</w:t>
+      </w:r>
+      <w:r>
+        <w:t xml:space="preserve"> SME </w:t>
+      </w:r>
+      <w:r>
+        <w:t xml:space="preserve">acquire </w:t>
+      </w:r>
+      <w:r>
+        <w:t xml:space="preserve">all relevant documentation related to the </w:t>
       </w:r>
       <w:r>
         <w:t>tool</w:t>
@@ -1660,7 +1672,7 @@
         <w:t xml:space="preserve">There are </w:t>
       </w:r>
       <w:r>
-        <w:t>five</w:t>
+        <w:t>six</w:t>
       </w:r>
       <w:r>
         <w:t xml:space="preserve"> </w:t>
@@ -1728,6 +1740,14 @@
       <w:pPr>
         <w:pStyle w:val="ListParagraph"/>
       </w:pPr>
+      <w:r>
+        <w:t>Categories</w:t>
+      </w:r>
+    </w:p>
+    <w:p>
+      <w:pPr>
+        <w:pStyle w:val="ListParagraph"/>
+      </w:pPr>
       <w:hyperlink w:anchor="_Legend" w:history="1">
         <w:r>
           <w:rPr>
@@ -1743,6 +1763,95 @@
       </w:pPr>
       <w:r>
         <w:t>These will be addressed in turn.</w:t>
+      </w:r>
+    </w:p>
+    <w:p>
+      <w:pPr>
+        <w:ind w:left="720" w:hanging="720"/>
+      </w:pPr>
+      <w:r>
+        <w:rPr>
+          <w:b/>
+          <w:bCs/>
+          <w:color w:val="0070C0"/>
+        </w:rPr>
+        <w:t>Note:</w:t>
+      </w:r>
+      <w:r>
+        <w:tab/>
+      </w:r>
+      <w:r>
+        <w:t xml:space="preserve">This </w:t>
+      </w:r>
+      <w:r>
+        <w:rPr>
+          <w:b/>
+          <w:bCs/>
+        </w:rPr>
+        <w:t>Categories</w:t>
+      </w:r>
+      <w:r>
+        <w:t xml:space="preserve"> sheet</w:t>
+      </w:r>
+      <w:r>
+        <w:t xml:space="preserve"> will be </w:t>
+      </w:r>
+      <w:r>
+        <w:t>covered</w:t>
+      </w:r>
+      <w:r>
+        <w:t xml:space="preserve"> in the </w:t>
+      </w:r>
+      <w:r>
+        <w:rPr>
+          <w:b/>
+          <w:bCs/>
+        </w:rPr>
+        <w:t>Categorize Security Options</w:t>
+      </w:r>
+      <w:r>
+        <w:rPr>
+          <w:b/>
+          <w:bCs/>
+          <w:color w:val="0070C0"/>
+        </w:rPr>
+        <w:t xml:space="preserve"> </w:t>
+      </w:r>
+      <w:r>
+        <w:rPr>
+          <w:b/>
+          <w:bCs/>
+          <w:color w:val="0070C0"/>
+          <w:vertAlign w:val="superscript"/>
+        </w:rPr>
+        <w:t>[</w:t>
+      </w:r>
+      <w:r>
+        <w:rPr>
+          <w:b/>
+          <w:bCs/>
+          <w:color w:val="0070C0"/>
+          <w:vertAlign w:val="superscript"/>
+        </w:rPr>
+        <w:t>5</w:t>
+      </w:r>
+      <w:r>
+        <w:rPr>
+          <w:b/>
+          <w:bCs/>
+          <w:color w:val="0070C0"/>
+          <w:vertAlign w:val="superscript"/>
+        </w:rPr>
+        <w:t>]</w:t>
+      </w:r>
+      <w:r>
+        <w:t xml:space="preserve"> </w:t>
+      </w:r>
+      <w:r>
+        <w:t>activity documentation</w:t>
+      </w:r>
+      <w:r>
+        <w:t>.</w:t>
       </w:r>
     </w:p>
     <w:p>
@@ -2477,8 +2586,8 @@
           <w:noProof/>
         </w:rPr>
         <w:drawing>
-          <wp:inline distT="0" distB="0" distL="0" distR="0" wp14:anchorId="37FBE858" wp14:editId="55D1D510">
-            <wp:extent cx="6052856" cy="1551044"/>
+          <wp:inline distT="0" distB="0" distL="0" distR="0" wp14:anchorId="37FBE858" wp14:editId="53A6FEFA">
+            <wp:extent cx="6052856" cy="1336027"/>
             <wp:effectExtent l="0" t="0" r="0" b="0"/>
             <wp:docPr id="1577273786" name="Picture 1"/>
             <wp:cNvGraphicFramePr>
@@ -2500,7 +2609,7 @@
                   <pic:spPr>
                     <a:xfrm>
                       <a:off x="0" y="0"/>
-                      <a:ext cx="6052856" cy="1551044"/>
+                      <a:ext cx="6052856" cy="1336027"/>
                     </a:xfrm>
                     <a:prstGeom prst="rect">
                       <a:avLst/>
@@ -2664,6 +2773,60 @@
         <w:pStyle w:val="Heading3"/>
       </w:pPr>
       <w:r>
+        <w:t>Category</w:t>
+      </w:r>
+    </w:p>
+    <w:p>
+      <w:r>
+        <w:t xml:space="preserve">This </w:t>
+      </w:r>
+      <w:r>
+        <w:t>is the option’s security priority category</w:t>
+      </w:r>
+      <w:r>
+        <w:t>.</w:t>
+      </w:r>
+    </w:p>
+    <w:p>
+      <w:pPr>
+        <w:ind w:left="720" w:hanging="720"/>
+      </w:pPr>
+      <w:r>
+        <w:rPr>
+          <w:b/>
+          <w:bCs/>
+          <w:color w:val="0070C0"/>
+        </w:rPr>
+        <w:t>Note:</w:t>
+      </w:r>
+      <w:r>
+        <w:tab/>
+      </w:r>
+      <w:r>
+        <w:t xml:space="preserve">This field will be addressed in the </w:t>
+      </w:r>
+      <w:r>
+        <w:rPr>
+          <w:b/>
+          <w:bCs/>
+        </w:rPr>
+        <w:t>Categorize Security Options</w:t>
+      </w:r>
+      <w:r>
+        <w:t xml:space="preserve"> </w:t>
+      </w:r>
+      <w:r>
+        <w:t>activity documentation</w:t>
+      </w:r>
+      <w:r>
+        <w:t>.</w:t>
+      </w:r>
+    </w:p>
+    <w:p>
+      <w:pPr>
+        <w:pStyle w:val="Heading3"/>
+      </w:pPr>
+      <w:r>
         <w:t>Notes</w:t>
       </w:r>
     </w:p>
@@ -2673,16 +2836,6 @@
       </w:pPr>
       <w:r>
         <w:t>This is a general notes field.</w:t>
-      </w:r>
-    </w:p>
-    <w:p>
-      <w:pPr>
-        <w:pStyle w:val="Heading2"/>
-      </w:pPr>
-    </w:p>
-    <w:p>
-      <w:r>
-        <w:br w:type="page"/>
       </w:r>
     </w:p>
     <w:p>
@@ -3033,6 +3186,74 @@
         </w:rPr>
         <w:t xml:space="preserve"> </w:t>
       </w:r>
+    </w:p>
+    <w:p>
+      <w:pPr>
+        <w:pStyle w:val="ListParagraph"/>
+        <w:numPr>
+          <w:ilvl w:val="0"/>
+          <w:numId w:val="3"/>
+        </w:numPr>
+        <w:spacing w:after="0"/>
+      </w:pPr>
+      <w:r>
+        <w:rPr>
+          <w:b/>
+          <w:bCs/>
+        </w:rPr>
+        <w:t xml:space="preserve">Secure Settings </w:t>
+      </w:r>
+      <w:r>
+        <w:rPr>
+          <w:b/>
+          <w:bCs/>
+        </w:rPr>
+        <w:t xml:space="preserve">– </w:t>
+      </w:r>
+      <w:r>
+        <w:rPr>
+          <w:b/>
+          <w:bCs/>
+        </w:rPr>
+        <w:t>Categorize</w:t>
+      </w:r>
+      <w:r>
+        <w:rPr>
+          <w:b/>
+          <w:bCs/>
+        </w:rPr>
+        <w:t xml:space="preserve"> Options Procedure</w:t>
+      </w:r>
+      <w:r>
+        <w:rPr>
+          <w:b/>
+          <w:bCs/>
+        </w:rPr>
+        <w:t xml:space="preserve"> </w:t>
+      </w:r>
+      <w:r>
+        <w:t xml:space="preserve">(AVCDL </w:t>
+      </w:r>
+      <w:r>
+        <w:t>tertiary</w:t>
+      </w:r>
+      <w:r>
+        <w:t xml:space="preserve"> document)</w:t>
+      </w:r>
+    </w:p>
+    <w:p>
+      <w:pPr>
+        <w:spacing w:after="0"/>
+        <w:ind w:left="360"/>
+        <w:jc w:val="left"/>
+        <w:rPr>
+          <w:rFonts w:ascii="Courier New" w:hAnsi="Courier New" w:cs="Courier New"/>
+          <w:b/>
+          <w:bCs/>
+          <w:sz w:val="21"/>
+          <w:szCs w:val="21"/>
+        </w:rPr>
+      </w:pPr>
     </w:p>
     <w:p>
       <w:pPr>

</xml_diff>